<commit_message>
Documento: carátula actualizada y PDF regenerado
Co-Authored-By: Claude Opus 5.5 <noreply@anthropic.com>
</commit_message>
<xml_diff>
--- a/docs/Documento_Fondo_de_Bikini.docx
+++ b/docs/Documento_Fondo_de_Bikini.docx
@@ -232,8 +232,6 @@
         <w:ind w:left="992" w:hanging="708"/>
         <w:rPr>
           <w:rFonts w:ascii="Arial" w:eastAsia="Arial" w:hAnsi="Arial" w:cs="Arial"/>
-          <w:b/>
-          <w:bCs/>
         </w:rPr>
       </w:pPr>
       <w:r>
@@ -242,39 +240,30 @@
           <w:b/>
           <w:bCs/>
         </w:rPr>
-        <w:t xml:space="preserve">DOCENTE: </w:t>
-      </w:r>
-      <w:r>
-        <w:rPr>
-          <w:rFonts w:ascii="Arial" w:hAnsi="Arial"/>
-          <w:highlight w:val="yellow"/>
-        </w:rPr>
-        <w:t>Ing. [nombre del docente]</w:t>
-      </w:r>
-    </w:p>
-    <w:p>
-      <w:pPr>
-        <w:keepLines/>
-        <w:spacing w:before="240" w:after="240"/>
-        <w:ind w:left="992" w:hanging="708"/>
+        <w:t xml:space="preserve">CARRERA: </w:t>
+      </w:r>
+      <w:proofErr w:type="spellStart"/>
+      <w:r>
         <w:rPr>
           <w:rFonts w:ascii="Arial" w:eastAsia="Arial" w:hAnsi="Arial" w:cs="Arial"/>
         </w:rPr>
-      </w:pPr>
+        <w:t>Ingenieria</w:t>
+      </w:r>
+      <w:proofErr w:type="spellEnd"/>
       <w:r>
         <w:rPr>
           <w:rFonts w:ascii="Arial" w:eastAsia="Arial" w:hAnsi="Arial" w:cs="Arial"/>
-          <w:b/>
-          <w:bCs/>
-        </w:rPr>
-        <w:t xml:space="preserve">CARRERA: </w:t>
-      </w:r>
+        </w:rPr>
+        <w:t xml:space="preserve"> en </w:t>
+      </w:r>
+      <w:proofErr w:type="spellStart"/>
       <w:r>
         <w:rPr>
           <w:rFonts w:ascii="Arial" w:eastAsia="Arial" w:hAnsi="Arial" w:cs="Arial"/>
         </w:rPr>
-        <w:t>Ingenieria en informatica</w:t>
-      </w:r>
+        <w:t>informatica</w:t>
+      </w:r>
+      <w:proofErr w:type="spellEnd"/>
     </w:p>
     <w:p>
       <w:pPr>
@@ -334,60 +323,35 @@
     </w:p>
     <w:p>
       <w:pPr>
-        <w:keepLines/>
-        <w:numPr>
-          <w:ilvl w:val="0"/>
-          <w:numId w:val="9"/>
-        </w:numPr>
-        <w:spacing w:after="160"/>
+        <w:spacing w:after="200"/>
         <w:rPr>
           <w:rFonts w:ascii="Arial" w:eastAsia="Arial" w:hAnsi="Arial" w:cs="Arial"/>
         </w:rPr>
       </w:pPr>
-      <w:r>
-        <w:rPr>
-          <w:rFonts w:ascii="Arial" w:eastAsia="Arial" w:hAnsi="Arial" w:cs="Arial"/>
-        </w:rPr>
-        <w:t>RODAS CABRERA JHOEL</w:t>
-      </w:r>
-      <w:r>
-        <w:rPr>
-          <w:rFonts w:ascii="Arial" w:eastAsia="Arial" w:hAnsi="Arial" w:cs="Arial"/>
-        </w:rPr>
-        <w:tab/>
-      </w:r>
-      <w:r>
-        <w:rPr>
-          <w:rFonts w:ascii="Arial" w:eastAsia="Arial" w:hAnsi="Arial" w:cs="Arial"/>
-        </w:rPr>
-        <w:tab/>
-      </w:r>
-      <w:r>
-        <w:rPr>
-          <w:rFonts w:ascii="Arial" w:eastAsia="Arial" w:hAnsi="Arial" w:cs="Arial"/>
-        </w:rPr>
-        <w:tab/>
-      </w:r>
-      <w:r>
-        <w:rPr>
-          <w:rFonts w:ascii="Arial" w:eastAsia="Arial" w:hAnsi="Arial" w:cs="Arial"/>
-        </w:rPr>
-        <w:tab/>
-        <w:t>221045661</w:t>
-      </w:r>
     </w:p>
     <w:p>
       <w:pPr>
+        <w:spacing w:after="200"/>
         <w:rPr>
           <w:rFonts w:ascii="Arial" w:eastAsia="Arial" w:hAnsi="Arial" w:cs="Arial"/>
         </w:rPr>
       </w:pPr>
-      <w:r>
+    </w:p>
+    <w:p>
+      <w:pPr>
+        <w:spacing w:after="200"/>
         <w:rPr>
           <w:rFonts w:ascii="Arial" w:eastAsia="Arial" w:hAnsi="Arial" w:cs="Arial"/>
         </w:rPr>
-        <w:br w:type="page"/>
-      </w:r>
+      </w:pPr>
+    </w:p>
+    <w:p>
+      <w:pPr>
+        <w:spacing w:after="200"/>
+        <w:rPr>
+          <w:rFonts w:ascii="Arial" w:eastAsia="Arial" w:hAnsi="Arial" w:cs="Arial"/>
+        </w:rPr>
+      </w:pPr>
     </w:p>
     <w:p>
       <w:pPr>
@@ -401,7 +365,6 @@
           <w:sz w:val="32"/>
           <w:szCs w:val="32"/>
         </w:rPr>
-        <w:lastRenderedPageBreak/>
         <w:t>Índice</w:t>
       </w:r>
     </w:p>
@@ -1776,7 +1739,15 @@
         <w:t>11 × 11 celdas</w:t>
       </w:r>
       <w:r>
-        <w:t xml:space="preserve"> conservando el tamaño de cada celda (10 unidades), con 25 manzanas conectadas por calles. Todos los componentes que dependían del tamaño del mapa (suelo, límites, colisiones, cámaras, farolas y minimapa) se calculan ahora a partir de la matriz </w:t>
+        <w:t xml:space="preserve"> conservando el tamaño de cada celda (10 unidades), con 25 manzanas conectadas por calles. Todos los componentes que dependían del tamaño del mapa (suelo, límites, colisiones, cámaras, farolas y </w:t>
+      </w:r>
+      <w:proofErr w:type="spellStart"/>
+      <w:r>
+        <w:t>minimapa</w:t>
+      </w:r>
+      <w:proofErr w:type="spellEnd"/>
+      <w:r>
+        <w:t xml:space="preserve">) se calculan ahora a partir de la matriz </w:t>
       </w:r>
       <w:r>
         <w:rPr>
@@ -1806,7 +1777,31 @@
         <w:t>Fondo de Bikini</w:t>
       </w:r>
       <w:r>
-        <w:t xml:space="preserve">: Bob Esponja reparte cinco Cangreburgers en su botemóvil y los personajes de la serie reaccionan cuando pasa. Además se implementaron las dos mejoras opcionales: </w:t>
+        <w:t xml:space="preserve">: Bob Esponja reparte cinco </w:t>
+      </w:r>
+      <w:proofErr w:type="spellStart"/>
+      <w:r>
+        <w:t>Cangreburgers</w:t>
+      </w:r>
+      <w:proofErr w:type="spellEnd"/>
+      <w:r>
+        <w:t xml:space="preserve"> en su </w:t>
+      </w:r>
+      <w:proofErr w:type="spellStart"/>
+      <w:r>
+        <w:t>botemóvil</w:t>
+      </w:r>
+      <w:proofErr w:type="spellEnd"/>
+      <w:r>
+        <w:t xml:space="preserve"> y los personajes de la serie reaccionan cuando pasa. </w:t>
+      </w:r>
+      <w:proofErr w:type="gramStart"/>
+      <w:r>
+        <w:t>Además</w:t>
+      </w:r>
+      <w:proofErr w:type="gramEnd"/>
+      <w:r>
+        <w:t xml:space="preserve"> se implementaron las dos mejoras opcionales: </w:t>
       </w:r>
       <w:r>
         <w:rPr>
@@ -1944,8 +1939,19 @@
           <w:sz w:val="20"/>
           <w:szCs w:val="20"/>
         </w:rPr>
-        <w:t>java -version</w:t>
-      </w:r>
+        <w:t>java -</w:t>
+      </w:r>
+      <w:proofErr w:type="spellStart"/>
+      <w:r>
+        <w:rPr>
+          <w:rFonts w:ascii="Consolas" w:eastAsia="Consolas" w:hAnsi="Consolas" w:cs="Consolas"/>
+          <w:color w:val="8A3B12"/>
+          <w:sz w:val="20"/>
+          <w:szCs w:val="20"/>
+        </w:rPr>
+        <w:t>version</w:t>
+      </w:r>
+      <w:proofErr w:type="spellEnd"/>
       <w:r>
         <w:t xml:space="preserve">). No es necesario instalar Maven: el proyecto incluye </w:t>
       </w:r>
@@ -1954,8 +1960,17 @@
           <w:b/>
           <w:bCs/>
         </w:rPr>
-        <w:t>Maven Wrapper</w:t>
-      </w:r>
+        <w:t xml:space="preserve">Maven </w:t>
+      </w:r>
+      <w:proofErr w:type="spellStart"/>
+      <w:r>
+        <w:rPr>
+          <w:b/>
+          <w:bCs/>
+        </w:rPr>
+        <w:t>Wrapper</w:t>
+      </w:r>
+      <w:proofErr w:type="spellEnd"/>
       <w:r>
         <w:t>, que lo descarga la primera vez junto con LWJGL.</w:t>
       </w:r>
@@ -1990,6 +2005,7 @@
       <w:r>
         <w:t xml:space="preserve">Desde la carpeta </w:t>
       </w:r>
+      <w:proofErr w:type="spellStart"/>
       <w:r>
         <w:rPr>
           <w:rFonts w:ascii="Consolas" w:eastAsia="Consolas" w:hAnsi="Consolas" w:cs="Consolas"/>
@@ -1999,6 +2015,7 @@
         </w:rPr>
         <w:t>CiudadConduccion</w:t>
       </w:r>
+      <w:proofErr w:type="spellEnd"/>
       <w:r>
         <w:t xml:space="preserve">, donde está </w:t>
       </w:r>
@@ -2019,12 +2036,16 @@
       <w:pPr>
         <w:shd w:val="clear" w:color="auto" w:fill="F1F3F5"/>
         <w:ind w:left="200"/>
+        <w:rPr>
+          <w:lang w:val="en-US"/>
+        </w:rPr>
       </w:pPr>
       <w:r>
         <w:rPr>
           <w:rFonts w:ascii="Consolas" w:eastAsia="Consolas" w:hAnsi="Consolas" w:cs="Consolas"/>
           <w:sz w:val="19"/>
           <w:szCs w:val="19"/>
+          <w:lang w:val="en-US"/>
         </w:rPr>
         <w:t># Windows (PowerShell o CMD)</w:t>
       </w:r>
@@ -2033,40 +2054,65 @@
       <w:pPr>
         <w:shd w:val="clear" w:color="auto" w:fill="F1F3F5"/>
         <w:ind w:left="200"/>
+        <w:rPr>
+          <w:lang w:val="en-US"/>
+        </w:rPr>
       </w:pPr>
       <w:r>
         <w:rPr>
           <w:rFonts w:ascii="Consolas" w:eastAsia="Consolas" w:hAnsi="Consolas" w:cs="Consolas"/>
           <w:sz w:val="19"/>
           <w:szCs w:val="19"/>
-        </w:rPr>
-        <w:t>.\mvnw.cmd compile exec:exec</w:t>
-      </w:r>
-    </w:p>
-    <w:p>
-      <w:pPr>
-        <w:shd w:val="clear" w:color="auto" w:fill="F1F3F5"/>
-        <w:ind w:left="200"/>
-      </w:pPr>
+          <w:lang w:val="en-US"/>
+        </w:rPr>
+        <w:t xml:space="preserve">.\mvnw.cmd compile </w:t>
+      </w:r>
+      <w:proofErr w:type="spellStart"/>
+      <w:proofErr w:type="gramStart"/>
       <w:r>
         <w:rPr>
           <w:rFonts w:ascii="Consolas" w:eastAsia="Consolas" w:hAnsi="Consolas" w:cs="Consolas"/>
           <w:sz w:val="19"/>
           <w:szCs w:val="19"/>
-        </w:rPr>
-        <w:t xml:space="preserve"> </w:t>
-      </w:r>
+          <w:lang w:val="en-US"/>
+        </w:rPr>
+        <w:t>exec:exec</w:t>
+      </w:r>
+      <w:proofErr w:type="spellEnd"/>
+      <w:proofErr w:type="gramEnd"/>
     </w:p>
     <w:p>
       <w:pPr>
         <w:shd w:val="clear" w:color="auto" w:fill="F1F3F5"/>
         <w:ind w:left="200"/>
+        <w:rPr>
+          <w:lang w:val="en-US"/>
+        </w:rPr>
       </w:pPr>
       <w:r>
         <w:rPr>
           <w:rFonts w:ascii="Consolas" w:eastAsia="Consolas" w:hAnsi="Consolas" w:cs="Consolas"/>
           <w:sz w:val="19"/>
           <w:szCs w:val="19"/>
+          <w:lang w:val="en-US"/>
+        </w:rPr>
+        <w:t xml:space="preserve"> </w:t>
+      </w:r>
+    </w:p>
+    <w:p>
+      <w:pPr>
+        <w:shd w:val="clear" w:color="auto" w:fill="F1F3F5"/>
+        <w:ind w:left="200"/>
+        <w:rPr>
+          <w:lang w:val="en-US"/>
+        </w:rPr>
+      </w:pPr>
+      <w:r>
+        <w:rPr>
+          <w:rFonts w:ascii="Consolas" w:eastAsia="Consolas" w:hAnsi="Consolas" w:cs="Consolas"/>
+          <w:sz w:val="19"/>
+          <w:szCs w:val="19"/>
+          <w:lang w:val="en-US"/>
         </w:rPr>
         <w:t># macOS / Linux</w:t>
       </w:r>
@@ -2076,15 +2122,52 @@
         <w:shd w:val="clear" w:color="auto" w:fill="F1F3F5"/>
         <w:spacing w:after="160"/>
         <w:ind w:left="200"/>
-      </w:pPr>
+        <w:rPr>
+          <w:lang w:val="en-US"/>
+        </w:rPr>
+      </w:pPr>
+      <w:proofErr w:type="gramStart"/>
       <w:r>
         <w:rPr>
           <w:rFonts w:ascii="Consolas" w:eastAsia="Consolas" w:hAnsi="Consolas" w:cs="Consolas"/>
           <w:sz w:val="19"/>
           <w:szCs w:val="19"/>
-        </w:rPr>
-        <w:t>./mvnw compile exec:exec</w:t>
-      </w:r>
+          <w:lang w:val="en-US"/>
+        </w:rPr>
+        <w:t>./</w:t>
+      </w:r>
+      <w:proofErr w:type="spellStart"/>
+      <w:proofErr w:type="gramEnd"/>
+      <w:r>
+        <w:rPr>
+          <w:rFonts w:ascii="Consolas" w:eastAsia="Consolas" w:hAnsi="Consolas" w:cs="Consolas"/>
+          <w:sz w:val="19"/>
+          <w:szCs w:val="19"/>
+          <w:lang w:val="en-US"/>
+        </w:rPr>
+        <w:t>mvnw</w:t>
+      </w:r>
+      <w:proofErr w:type="spellEnd"/>
+      <w:r>
+        <w:rPr>
+          <w:rFonts w:ascii="Consolas" w:eastAsia="Consolas" w:hAnsi="Consolas" w:cs="Consolas"/>
+          <w:sz w:val="19"/>
+          <w:szCs w:val="19"/>
+          <w:lang w:val="en-US"/>
+        </w:rPr>
+        <w:t xml:space="preserve"> compile </w:t>
+      </w:r>
+      <w:proofErr w:type="spellStart"/>
+      <w:r>
+        <w:rPr>
+          <w:rFonts w:ascii="Consolas" w:eastAsia="Consolas" w:hAnsi="Consolas" w:cs="Consolas"/>
+          <w:sz w:val="19"/>
+          <w:szCs w:val="19"/>
+          <w:lang w:val="en-US"/>
+        </w:rPr>
+        <w:t>exec:exec</w:t>
+      </w:r>
+      <w:proofErr w:type="spellEnd"/>
     </w:p>
     <w:p>
       <w:pPr>
@@ -2093,6 +2176,7 @@
       <w:r>
         <w:t xml:space="preserve">Con Maven instalado, </w:t>
       </w:r>
+      <w:proofErr w:type="spellStart"/>
       <w:r>
         <w:rPr>
           <w:rFonts w:ascii="Consolas" w:eastAsia="Consolas" w:hAnsi="Consolas" w:cs="Consolas"/>
@@ -2100,11 +2184,9 @@
           <w:sz w:val="20"/>
           <w:szCs w:val="20"/>
         </w:rPr>
-        <w:t>mvn compile exec:exec</w:t>
-      </w:r>
-      <w:r>
-        <w:t xml:space="preserve"> es equivalente. El punto de entrada es </w:t>
-      </w:r>
+        <w:t>mvn</w:t>
+      </w:r>
+      <w:proofErr w:type="spellEnd"/>
       <w:r>
         <w:rPr>
           <w:rFonts w:ascii="Consolas" w:eastAsia="Consolas" w:hAnsi="Consolas" w:cs="Consolas"/>
@@ -2112,21 +2194,10 @@
           <w:sz w:val="20"/>
           <w:szCs w:val="20"/>
         </w:rPr>
-        <w:t>com.graphics.Main</w:t>
-      </w:r>
-      <w:r>
-        <w:t xml:space="preserve">; también se puede ejecutar desde VS Code con </w:t>
-      </w:r>
-      <w:r>
-        <w:rPr>
-          <w:b/>
-          <w:bCs/>
-        </w:rPr>
-        <w:t>Run</w:t>
-      </w:r>
-      <w:r>
-        <w:t xml:space="preserve"> sobre </w:t>
-      </w:r>
+        <w:t xml:space="preserve"> compile </w:t>
+      </w:r>
+      <w:proofErr w:type="spellStart"/>
+      <w:proofErr w:type="gramStart"/>
       <w:r>
         <w:rPr>
           <w:rFonts w:ascii="Consolas" w:eastAsia="Consolas" w:hAnsi="Consolas" w:cs="Consolas"/>
@@ -2134,65 +2205,15 @@
           <w:sz w:val="20"/>
           <w:szCs w:val="20"/>
         </w:rPr>
-        <w:t>Main.java</w:t>
-      </w:r>
-      <w:r>
-        <w:t xml:space="preserve">. El juego abre en el menú </w:t>
-      </w:r>
-      <w:r>
-        <w:rPr>
-          <w:b/>
-          <w:bCs/>
-        </w:rPr>
-        <w:t>FONDO DE BIKINI</w:t>
-      </w:r>
-      <w:r>
-        <w:t xml:space="preserve"> y se empieza con </w:t>
-      </w:r>
-      <w:r>
-        <w:rPr>
-          <w:b/>
-          <w:bCs/>
-        </w:rPr>
-        <w:t>P</w:t>
-      </w:r>
-      <w:r>
-        <w:t>.</w:t>
-      </w:r>
-    </w:p>
-    <w:p>
-      <w:pPr>
-        <w:pStyle w:val="Ttulo2"/>
-      </w:pPr>
-      <w:bookmarkStart w:id="4" w:name="_Toc242494643"/>
-      <w:r>
-        <w:t>2.3 Pruebas automáticas</w:t>
-      </w:r>
-      <w:bookmarkEnd w:id="4"/>
-    </w:p>
-    <w:p>
-      <w:pPr>
-        <w:shd w:val="clear" w:color="auto" w:fill="F1F3F5"/>
-        <w:spacing w:after="160"/>
-        <w:ind w:left="200"/>
-      </w:pPr>
-      <w:r>
-        <w:rPr>
-          <w:rFonts w:ascii="Consolas" w:eastAsia="Consolas" w:hAnsi="Consolas" w:cs="Consolas"/>
-          <w:sz w:val="19"/>
-          <w:szCs w:val="19"/>
-        </w:rPr>
-        <w:t>.\mvnw.cmd test</w:t>
-      </w:r>
-    </w:p>
-    <w:p>
-      <w:pPr>
-        <w:spacing w:after="120"/>
-      </w:pPr>
-      <w:r>
-        <w:lastRenderedPageBreak/>
-        <w:t xml:space="preserve">Se ejecutan 11 pruebas sin abrir ventanas (sección 7). Para un arranque gráfico breve se puede pasar </w:t>
-      </w:r>
+        <w:t>exec:exec</w:t>
+      </w:r>
+      <w:proofErr w:type="spellEnd"/>
+      <w:proofErr w:type="gramEnd"/>
+      <w:r>
+        <w:t xml:space="preserve"> es equivalente. El punto de entrada es </w:t>
+      </w:r>
+      <w:proofErr w:type="spellStart"/>
+      <w:proofErr w:type="gramStart"/>
       <w:r>
         <w:rPr>
           <w:rFonts w:ascii="Consolas" w:eastAsia="Consolas" w:hAnsi="Consolas" w:cs="Consolas"/>
@@ -2200,10 +2221,145 @@
           <w:sz w:val="20"/>
           <w:szCs w:val="20"/>
         </w:rPr>
-        <w:t>-Ddemo.frames=30</w:t>
-      </w:r>
-      <w:r>
-        <w:t xml:space="preserve"> a la JVM del juego: la ventana se cierra sola tras 30 cuadros y cualquier error de shaders u OpenGL aparece en la consola.</w:t>
+        <w:t>com.graphics</w:t>
+      </w:r>
+      <w:proofErr w:type="gramEnd"/>
+      <w:r>
+        <w:rPr>
+          <w:rFonts w:ascii="Consolas" w:eastAsia="Consolas" w:hAnsi="Consolas" w:cs="Consolas"/>
+          <w:color w:val="8A3B12"/>
+          <w:sz w:val="20"/>
+          <w:szCs w:val="20"/>
+        </w:rPr>
+        <w:t>.Main</w:t>
+      </w:r>
+      <w:proofErr w:type="spellEnd"/>
+      <w:r>
+        <w:t xml:space="preserve">; también se puede ejecutar desde VS </w:t>
+      </w:r>
+      <w:proofErr w:type="spellStart"/>
+      <w:r>
+        <w:t>Code</w:t>
+      </w:r>
+      <w:proofErr w:type="spellEnd"/>
+      <w:r>
+        <w:t xml:space="preserve"> con </w:t>
+      </w:r>
+      <w:r>
+        <w:rPr>
+          <w:b/>
+          <w:bCs/>
+        </w:rPr>
+        <w:t>Run</w:t>
+      </w:r>
+      <w:r>
+        <w:t xml:space="preserve"> sobre </w:t>
+      </w:r>
+      <w:r>
+        <w:rPr>
+          <w:rFonts w:ascii="Consolas" w:eastAsia="Consolas" w:hAnsi="Consolas" w:cs="Consolas"/>
+          <w:color w:val="8A3B12"/>
+          <w:sz w:val="20"/>
+          <w:szCs w:val="20"/>
+        </w:rPr>
+        <w:t>Main.java</w:t>
+      </w:r>
+      <w:r>
+        <w:t xml:space="preserve">. El juego abre en el menú </w:t>
+      </w:r>
+      <w:r>
+        <w:rPr>
+          <w:b/>
+          <w:bCs/>
+        </w:rPr>
+        <w:t>FONDO DE BIKINI</w:t>
+      </w:r>
+      <w:r>
+        <w:t xml:space="preserve"> y se empieza con </w:t>
+      </w:r>
+      <w:r>
+        <w:rPr>
+          <w:b/>
+          <w:bCs/>
+        </w:rPr>
+        <w:t>P</w:t>
+      </w:r>
+      <w:r>
+        <w:t>.</w:t>
+      </w:r>
+    </w:p>
+    <w:p>
+      <w:pPr>
+        <w:pStyle w:val="Ttulo2"/>
+      </w:pPr>
+      <w:bookmarkStart w:id="4" w:name="_Toc242494643"/>
+      <w:r>
+        <w:t>2.3 Pruebas automáticas</w:t>
+      </w:r>
+      <w:bookmarkEnd w:id="4"/>
+    </w:p>
+    <w:p>
+      <w:pPr>
+        <w:shd w:val="clear" w:color="auto" w:fill="F1F3F5"/>
+        <w:spacing w:after="160"/>
+        <w:ind w:left="200"/>
+      </w:pPr>
+      <w:r>
+        <w:rPr>
+          <w:rFonts w:ascii="Consolas" w:eastAsia="Consolas" w:hAnsi="Consolas" w:cs="Consolas"/>
+          <w:sz w:val="19"/>
+          <w:szCs w:val="19"/>
+        </w:rPr>
+        <w:t>.\mvnw.cmd test</w:t>
+      </w:r>
+    </w:p>
+    <w:p>
+      <w:pPr>
+        <w:spacing w:after="120"/>
+      </w:pPr>
+      <w:r>
+        <w:lastRenderedPageBreak/>
+        <w:t xml:space="preserve">Se ejecutan 11 pruebas sin abrir ventanas (sección 7). Para un arranque gráfico breve se puede pasar </w:t>
+      </w:r>
+      <w:r>
+        <w:rPr>
+          <w:rFonts w:ascii="Consolas" w:eastAsia="Consolas" w:hAnsi="Consolas" w:cs="Consolas"/>
+          <w:color w:val="8A3B12"/>
+          <w:sz w:val="20"/>
+          <w:szCs w:val="20"/>
+        </w:rPr>
+        <w:t>-</w:t>
+      </w:r>
+      <w:proofErr w:type="spellStart"/>
+      <w:r>
+        <w:rPr>
+          <w:rFonts w:ascii="Consolas" w:eastAsia="Consolas" w:hAnsi="Consolas" w:cs="Consolas"/>
+          <w:color w:val="8A3B12"/>
+          <w:sz w:val="20"/>
+          <w:szCs w:val="20"/>
+        </w:rPr>
+        <w:t>Ddemo.frames</w:t>
+      </w:r>
+      <w:proofErr w:type="spellEnd"/>
+      <w:r>
+        <w:rPr>
+          <w:rFonts w:ascii="Consolas" w:eastAsia="Consolas" w:hAnsi="Consolas" w:cs="Consolas"/>
+          <w:color w:val="8A3B12"/>
+          <w:sz w:val="20"/>
+          <w:szCs w:val="20"/>
+        </w:rPr>
+        <w:t>=30</w:t>
+      </w:r>
+      <w:r>
+        <w:t xml:space="preserve"> a la JVM del juego: la ventana se cierra sola tras 30 cuadros y cualquier error de </w:t>
+      </w:r>
+      <w:proofErr w:type="spellStart"/>
+      <w:r>
+        <w:t>shaders</w:t>
+      </w:r>
+      <w:proofErr w:type="spellEnd"/>
+      <w:r>
+        <w:t xml:space="preserve"> u OpenGL aparece en la consola.</w:t>
       </w:r>
     </w:p>
     <w:p>
@@ -5388,9 +5544,14 @@
       </w:pPr>
       <w:bookmarkStart w:id="6" w:name="_Toc242494645"/>
       <w:r>
-        <w:t>3.1 Adaptación de suelo, límites, colisiones, cámaras y minimapa</w:t>
+        <w:t xml:space="preserve">3.1 Adaptación de suelo, límites, colisiones, cámaras y </w:t>
+      </w:r>
+      <w:proofErr w:type="spellStart"/>
+      <w:r>
+        <w:t>minimapa</w:t>
       </w:r>
       <w:bookmarkEnd w:id="6"/>
+      <w:proofErr w:type="spellEnd"/>
     </w:p>
     <w:p>
       <w:pPr>
@@ -5592,7 +5753,27 @@
                 <w:sz w:val="20"/>
                 <w:szCs w:val="20"/>
               </w:rPr>
-              <w:t>LIMITE = MAPA.length * CELDA / 2</w:t>
+              <w:t xml:space="preserve">LIMITE = </w:t>
+            </w:r>
+            <w:proofErr w:type="spellStart"/>
+            <w:r>
+              <w:rPr>
+                <w:rFonts w:ascii="Consolas" w:eastAsia="Consolas" w:hAnsi="Consolas" w:cs="Consolas"/>
+                <w:color w:val="8A3B12"/>
+                <w:sz w:val="20"/>
+                <w:szCs w:val="20"/>
+              </w:rPr>
+              <w:t>MAPA.length</w:t>
+            </w:r>
+            <w:proofErr w:type="spellEnd"/>
+            <w:r>
+              <w:rPr>
+                <w:rFonts w:ascii="Consolas" w:eastAsia="Consolas" w:hAnsi="Consolas" w:cs="Consolas"/>
+                <w:color w:val="8A3B12"/>
+                <w:sz w:val="20"/>
+                <w:szCs w:val="20"/>
+              </w:rPr>
+              <w:t xml:space="preserve"> * CELDA / 2</w:t>
             </w:r>
             <w:r>
               <w:t xml:space="preserve"> → 55</w:t>
@@ -5862,8 +6043,13 @@
           </w:tcPr>
           <w:p>
             <w:r>
-              <w:t>Escala del minimapa</w:t>
-            </w:r>
+              <w:t xml:space="preserve">Escala del </w:t>
+            </w:r>
+            <w:proofErr w:type="spellStart"/>
+            <w:r>
+              <w:t>minimapa</w:t>
+            </w:r>
+            <w:proofErr w:type="spellEnd"/>
           </w:p>
         </w:tc>
         <w:tc>
@@ -5893,8 +6079,13 @@
               <w:t>/ 37.0</w:t>
             </w:r>
             <w:r>
-              <w:t xml:space="preserve"> fijo en el shader</w:t>
-            </w:r>
+              <w:t xml:space="preserve"> fijo en el </w:t>
+            </w:r>
+            <w:proofErr w:type="spellStart"/>
+            <w:r>
+              <w:t>shader</w:t>
+            </w:r>
+            <w:proofErr w:type="spellEnd"/>
           </w:p>
         </w:tc>
         <w:tc>
@@ -5914,9 +6105,15 @@
             </w:tcMar>
           </w:tcPr>
           <w:p>
-            <w:r>
-              <w:t xml:space="preserve">uniform </w:t>
-            </w:r>
+            <w:proofErr w:type="spellStart"/>
+            <w:r>
+              <w:t>uniform</w:t>
+            </w:r>
+            <w:proofErr w:type="spellEnd"/>
+            <w:r>
+              <w:t xml:space="preserve"> </w:t>
+            </w:r>
+            <w:proofErr w:type="spellStart"/>
             <w:r>
               <w:rPr>
                 <w:rFonts w:ascii="Consolas" w:eastAsia="Consolas" w:hAnsi="Consolas" w:cs="Consolas"/>
@@ -5926,9 +6123,11 @@
               </w:rPr>
               <w:t>uLimite</w:t>
             </w:r>
+            <w:proofErr w:type="spellEnd"/>
             <w:r>
               <w:t xml:space="preserve"> (encuadre = </w:t>
             </w:r>
+            <w:proofErr w:type="spellStart"/>
             <w:r>
               <w:rPr>
                 <w:rFonts w:ascii="Consolas" w:eastAsia="Consolas" w:hAnsi="Consolas" w:cs="Consolas"/>
@@ -5936,7 +6135,17 @@
                 <w:sz w:val="20"/>
                 <w:szCs w:val="20"/>
               </w:rPr>
-              <w:t>uLimite + 2</w:t>
+              <w:t>uLimite</w:t>
+            </w:r>
+            <w:proofErr w:type="spellEnd"/>
+            <w:r>
+              <w:rPr>
+                <w:rFonts w:ascii="Consolas" w:eastAsia="Consolas" w:hAnsi="Consolas" w:cs="Consolas"/>
+                <w:color w:val="8A3B12"/>
+                <w:sz w:val="20"/>
+                <w:szCs w:val="20"/>
+              </w:rPr>
+              <w:t xml:space="preserve"> + 2</w:t>
             </w:r>
             <w:r>
               <w:t>)</w:t>
@@ -6006,6 +6215,7 @@
             </w:tcMar>
           </w:tcPr>
           <w:p>
+            <w:proofErr w:type="spellStart"/>
             <w:r>
               <w:rPr>
                 <w:rFonts w:ascii="Consolas" w:eastAsia="Consolas" w:hAnsi="Consolas" w:cs="Consolas"/>
@@ -6015,8 +6225,17 @@
               </w:rPr>
               <w:t>Farola.POSICIONES</w:t>
             </w:r>
-            <w:r>
-              <w:t xml:space="preserve">: una por manzana; el shader recibe </w:t>
+            <w:proofErr w:type="spellEnd"/>
+            <w:r>
+              <w:t xml:space="preserve">: una por manzana; el </w:t>
+            </w:r>
+            <w:proofErr w:type="spellStart"/>
+            <w:r>
+              <w:t>shader</w:t>
+            </w:r>
+            <w:proofErr w:type="spellEnd"/>
+            <w:r>
+              <w:t xml:space="preserve"> recibe </w:t>
             </w:r>
             <w:r>
               <w:rPr>
@@ -6376,6 +6595,7 @@
             </w:tcMar>
           </w:tcPr>
           <w:p>
+            <w:proofErr w:type="spellStart"/>
             <w:r>
               <w:rPr>
                 <w:rFonts w:ascii="Consolas" w:eastAsia="Consolas" w:hAnsi="Consolas" w:cs="Consolas"/>
@@ -6385,6 +6605,7 @@
               </w:rPr>
               <w:t>Main</w:t>
             </w:r>
+            <w:proofErr w:type="spellEnd"/>
             <w:r>
               <w:t xml:space="preserve">, </w:t>
             </w:r>
@@ -6480,6 +6701,7 @@
             <w:r>
               <w:t xml:space="preserve">, </w:t>
             </w:r>
+            <w:proofErr w:type="spellStart"/>
             <w:r>
               <w:rPr>
                 <w:rFonts w:ascii="Consolas" w:eastAsia="Consolas" w:hAnsi="Consolas" w:cs="Consolas"/>
@@ -6489,9 +6711,11 @@
               </w:rPr>
               <w:t>Renderizador</w:t>
             </w:r>
+            <w:proofErr w:type="spellEnd"/>
             <w:r>
               <w:t xml:space="preserve">, </w:t>
             </w:r>
+            <w:proofErr w:type="spellStart"/>
             <w:r>
               <w:rPr>
                 <w:rFonts w:ascii="Consolas" w:eastAsia="Consolas" w:hAnsi="Consolas" w:cs="Consolas"/>
@@ -6501,9 +6725,11 @@
               </w:rPr>
               <w:t>Shaders</w:t>
             </w:r>
+            <w:proofErr w:type="spellEnd"/>
             <w:r>
               <w:t xml:space="preserve">, </w:t>
             </w:r>
+            <w:proofErr w:type="spellStart"/>
             <w:r>
               <w:rPr>
                 <w:rFonts w:ascii="Consolas" w:eastAsia="Consolas" w:hAnsi="Consolas" w:cs="Consolas"/>
@@ -6513,6 +6739,7 @@
               </w:rPr>
               <w:t>Camara</w:t>
             </w:r>
+            <w:proofErr w:type="spellEnd"/>
             <w:r>
               <w:t xml:space="preserve">, </w:t>
             </w:r>
@@ -6559,6 +6786,7 @@
             <w:r>
               <w:t xml:space="preserve">Cómo se dibuja: ventana y teclado (GLFW), el cubo y </w:t>
             </w:r>
+            <w:proofErr w:type="gramStart"/>
             <w:r>
               <w:rPr>
                 <w:rFonts w:ascii="Consolas" w:eastAsia="Consolas" w:hAnsi="Consolas" w:cs="Consolas"/>
@@ -6566,7 +6794,17 @@
                 <w:sz w:val="20"/>
                 <w:szCs w:val="20"/>
               </w:rPr>
-              <w:t>caja()</w:t>
+              <w:t>caja(</w:t>
+            </w:r>
+            <w:proofErr w:type="gramEnd"/>
+            <w:r>
+              <w:rPr>
+                <w:rFonts w:ascii="Consolas" w:eastAsia="Consolas" w:hAnsi="Consolas" w:cs="Consolas"/>
+                <w:color w:val="8A3B12"/>
+                <w:sz w:val="20"/>
+                <w:szCs w:val="20"/>
+              </w:rPr>
+              <w:t>)</w:t>
             </w:r>
             <w:r>
               <w:t>, el código GLSL, la cámara y las letras</w:t>
@@ -6680,6 +6918,7 @@
             <w:r>
               <w:t xml:space="preserve">, </w:t>
             </w:r>
+            <w:proofErr w:type="spellStart"/>
             <w:r>
               <w:rPr>
                 <w:rFonts w:ascii="Consolas" w:eastAsia="Consolas" w:hAnsi="Consolas" w:cs="Consolas"/>
@@ -6689,6 +6928,7 @@
               </w:rPr>
               <w:t>Arbol</w:t>
             </w:r>
+            <w:proofErr w:type="spellEnd"/>
             <w:r>
               <w:t xml:space="preserve">, </w:t>
             </w:r>
@@ -6728,6 +6968,7 @@
             <w:r>
               <w:t xml:space="preserve">, </w:t>
             </w:r>
+            <w:proofErr w:type="spellStart"/>
             <w:r>
               <w:rPr>
                 <w:rFonts w:ascii="Consolas" w:eastAsia="Consolas" w:hAnsi="Consolas" w:cs="Consolas"/>
@@ -6737,9 +6978,11 @@
               </w:rPr>
               <w:t>Semaforo</w:t>
             </w:r>
+            <w:proofErr w:type="spellEnd"/>
             <w:r>
               <w:t xml:space="preserve">, </w:t>
             </w:r>
+            <w:proofErr w:type="spellStart"/>
             <w:r>
               <w:rPr>
                 <w:rFonts w:ascii="Consolas" w:eastAsia="Consolas" w:hAnsi="Consolas" w:cs="Consolas"/>
@@ -6749,6 +6992,7 @@
               </w:rPr>
               <w:t>LugaresBikini</w:t>
             </w:r>
+            <w:proofErr w:type="spellEnd"/>
           </w:p>
         </w:tc>
         <w:tc>
@@ -6792,6 +7036,7 @@
             </w:tcMar>
           </w:tcPr>
           <w:p>
+            <w:proofErr w:type="spellStart"/>
             <w:r>
               <w:rPr>
                 <w:rFonts w:ascii="Consolas" w:eastAsia="Consolas" w:hAnsi="Consolas" w:cs="Consolas"/>
@@ -6801,6 +7046,7 @@
               </w:rPr>
               <w:t>vehiculos</w:t>
             </w:r>
+            <w:proofErr w:type="spellEnd"/>
           </w:p>
         </w:tc>
         <w:tc>
@@ -6832,6 +7078,7 @@
             <w:r>
               <w:t xml:space="preserve">, </w:t>
             </w:r>
+            <w:proofErr w:type="spellStart"/>
             <w:r>
               <w:rPr>
                 <w:rFonts w:ascii="Consolas" w:eastAsia="Consolas" w:hAnsi="Consolas" w:cs="Consolas"/>
@@ -6841,6 +7088,7 @@
               </w:rPr>
               <w:t>Vehiculo</w:t>
             </w:r>
+            <w:proofErr w:type="spellEnd"/>
             <w:r>
               <w:t xml:space="preserve">, </w:t>
             </w:r>
@@ -6948,6 +7196,7 @@
             <w:r>
               <w:t xml:space="preserve">, </w:t>
             </w:r>
+            <w:proofErr w:type="spellStart"/>
             <w:r>
               <w:rPr>
                 <w:rFonts w:ascii="Consolas" w:eastAsia="Consolas" w:hAnsi="Consolas" w:cs="Consolas"/>
@@ -6957,6 +7206,7 @@
               </w:rPr>
               <w:t>VidaMarina</w:t>
             </w:r>
+            <w:proofErr w:type="spellEnd"/>
           </w:p>
         </w:tc>
         <w:tc>
@@ -7028,6 +7278,7 @@
             </w:tcMar>
           </w:tcPr>
           <w:p>
+            <w:proofErr w:type="spellStart"/>
             <w:r>
               <w:rPr>
                 <w:rFonts w:ascii="Consolas" w:eastAsia="Consolas" w:hAnsi="Consolas" w:cs="Consolas"/>
@@ -7037,6 +7288,7 @@
               </w:rPr>
               <w:t>Iluminacion</w:t>
             </w:r>
+            <w:proofErr w:type="spellEnd"/>
             <w:r>
               <w:t xml:space="preserve">, </w:t>
             </w:r>
@@ -7120,6 +7372,7 @@
             </w:tcMar>
           </w:tcPr>
           <w:p>
+            <w:proofErr w:type="spellStart"/>
             <w:r>
               <w:rPr>
                 <w:rFonts w:ascii="Consolas" w:eastAsia="Consolas" w:hAnsi="Consolas" w:cs="Consolas"/>
@@ -7129,6 +7382,7 @@
               </w:rPr>
               <w:t>Minimapa</w:t>
             </w:r>
+            <w:proofErr w:type="spellEnd"/>
             <w:r>
               <w:t xml:space="preserve">, </w:t>
             </w:r>
@@ -7208,6 +7462,7 @@
       <w:r>
         <w:t xml:space="preserve"> con </w:t>
       </w:r>
+      <w:proofErr w:type="spellStart"/>
       <w:r>
         <w:rPr>
           <w:rFonts w:ascii="Consolas" w:eastAsia="Consolas" w:hAnsi="Consolas" w:cs="Consolas"/>
@@ -7217,6 +7472,7 @@
         </w:rPr>
         <w:t>deltaTime</w:t>
       </w:r>
+      <w:proofErr w:type="spellEnd"/>
       <w:r>
         <w:t xml:space="preserve"> (segundos desde el cuadro anterior): </w:t>
       </w:r>
@@ -7256,6 +7512,7 @@
       <w:r>
         <w:t xml:space="preserve"> mueve los botes; en pausa </w:t>
       </w:r>
+      <w:proofErr w:type="spellStart"/>
       <w:r>
         <w:rPr>
           <w:rFonts w:ascii="Consolas" w:eastAsia="Consolas" w:hAnsi="Consolas" w:cs="Consolas"/>
@@ -7265,6 +7522,7 @@
         </w:rPr>
         <w:t>deltaTime</w:t>
       </w:r>
+      <w:proofErr w:type="spellEnd"/>
       <w:r>
         <w:t xml:space="preserve"> vale 0. Después </w:t>
       </w:r>
@@ -7278,6 +7536,7 @@
       <w:r>
         <w:t xml:space="preserve"> en tres pasadas: la vista principal (</w:t>
       </w:r>
+      <w:proofErr w:type="spellStart"/>
       <w:r>
         <w:rPr>
           <w:rFonts w:ascii="Consolas" w:eastAsia="Consolas" w:hAnsi="Consolas" w:cs="Consolas"/>
@@ -7287,9 +7546,11 @@
         </w:rPr>
         <w:t>Camara</w:t>
       </w:r>
+      <w:proofErr w:type="spellEnd"/>
       <w:r>
         <w:t xml:space="preserve"> e </w:t>
       </w:r>
+      <w:proofErr w:type="spellStart"/>
       <w:r>
         <w:rPr>
           <w:rFonts w:ascii="Consolas" w:eastAsia="Consolas" w:hAnsi="Consolas" w:cs="Consolas"/>
@@ -7299,9 +7560,19 @@
         </w:rPr>
         <w:t>Iluminacion</w:t>
       </w:r>
-      <w:r>
-        <w:t xml:space="preserve"> envían sus datos al shader y luego se dibuja la escena), el </w:t>
-      </w:r>
+      <w:proofErr w:type="spellEnd"/>
+      <w:r>
+        <w:t xml:space="preserve"> envían sus datos al </w:t>
+      </w:r>
+      <w:proofErr w:type="spellStart"/>
+      <w:r>
+        <w:t>shader</w:t>
+      </w:r>
+      <w:proofErr w:type="spellEnd"/>
+      <w:r>
+        <w:t xml:space="preserve"> y luego se dibuja la escena), el </w:t>
+      </w:r>
+      <w:proofErr w:type="spellStart"/>
       <w:r>
         <w:rPr>
           <w:rFonts w:ascii="Consolas" w:eastAsia="Consolas" w:hAnsi="Consolas" w:cs="Consolas"/>
@@ -7311,6 +7582,7 @@
         </w:rPr>
         <w:t>Minimapa</w:t>
       </w:r>
+      <w:proofErr w:type="spellEnd"/>
       <w:r>
         <w:t xml:space="preserve"> (la misma escena desde arriba en un recuadro) y el </w:t>
       </w:r>
@@ -7326,6 +7598,7 @@
       <w:r>
         <w:t xml:space="preserve"> (texto en píxeles de pantalla). Todo objeto visible tiene un método </w:t>
       </w:r>
+      <w:proofErr w:type="gramStart"/>
       <w:r>
         <w:rPr>
           <w:rFonts w:ascii="Consolas" w:eastAsia="Consolas" w:hAnsi="Consolas" w:cs="Consolas"/>
@@ -7333,11 +7606,10 @@
           <w:sz w:val="20"/>
           <w:szCs w:val="20"/>
         </w:rPr>
-        <w:t>dibujar(Renderizador r, ...)</w:t>
-      </w:r>
-      <w:r>
-        <w:t xml:space="preserve"> que arma su forma con </w:t>
-      </w:r>
+        <w:t>dibujar(</w:t>
+      </w:r>
+      <w:proofErr w:type="spellStart"/>
+      <w:proofErr w:type="gramEnd"/>
       <w:r>
         <w:rPr>
           <w:rFonts w:ascii="Consolas" w:eastAsia="Consolas" w:hAnsi="Consolas" w:cs="Consolas"/>
@@ -7345,11 +7617,9 @@
           <w:sz w:val="20"/>
           <w:szCs w:val="20"/>
         </w:rPr>
-        <w:t>r.caja(...)</w:t>
-      </w:r>
-      <w:r>
-        <w:t xml:space="preserve">; los que giran usan </w:t>
-      </w:r>
+        <w:t>Renderizador</w:t>
+      </w:r>
+      <w:proofErr w:type="spellEnd"/>
       <w:r>
         <w:rPr>
           <w:rFonts w:ascii="Consolas" w:eastAsia="Consolas" w:hAnsi="Consolas" w:cs="Consolas"/>
@@ -7357,11 +7627,12 @@
           <w:sz w:val="20"/>
           <w:szCs w:val="20"/>
         </w:rPr>
-        <w:t>r.origen(x, z, giro)</w:t>
-      </w:r>
-      <w:r>
-        <w:t xml:space="preserve"> y </w:t>
-      </w:r>
+        <w:t xml:space="preserve"> r, ...)</w:t>
+      </w:r>
+      <w:r>
+        <w:t xml:space="preserve"> que arma su forma con </w:t>
+      </w:r>
+      <w:proofErr w:type="spellStart"/>
       <w:r>
         <w:rPr>
           <w:rFonts w:ascii="Consolas" w:eastAsia="Consolas" w:hAnsi="Consolas" w:cs="Consolas"/>
@@ -7369,7 +7640,63 @@
           <w:sz w:val="20"/>
           <w:szCs w:val="20"/>
         </w:rPr>
-        <w:t>r.parte(...)</w:t>
+        <w:t>r.caja</w:t>
+      </w:r>
+      <w:proofErr w:type="spellEnd"/>
+      <w:r>
+        <w:rPr>
+          <w:rFonts w:ascii="Consolas" w:eastAsia="Consolas" w:hAnsi="Consolas" w:cs="Consolas"/>
+          <w:color w:val="8A3B12"/>
+          <w:sz w:val="20"/>
+          <w:szCs w:val="20"/>
+        </w:rPr>
+        <w:t>(...)</w:t>
+      </w:r>
+      <w:r>
+        <w:t xml:space="preserve">; los que giran usan </w:t>
+      </w:r>
+      <w:proofErr w:type="spellStart"/>
+      <w:r>
+        <w:rPr>
+          <w:rFonts w:ascii="Consolas" w:eastAsia="Consolas" w:hAnsi="Consolas" w:cs="Consolas"/>
+          <w:color w:val="8A3B12"/>
+          <w:sz w:val="20"/>
+          <w:szCs w:val="20"/>
+        </w:rPr>
+        <w:t>r.origen</w:t>
+      </w:r>
+      <w:proofErr w:type="spellEnd"/>
+      <w:r>
+        <w:rPr>
+          <w:rFonts w:ascii="Consolas" w:eastAsia="Consolas" w:hAnsi="Consolas" w:cs="Consolas"/>
+          <w:color w:val="8A3B12"/>
+          <w:sz w:val="20"/>
+          <w:szCs w:val="20"/>
+        </w:rPr>
+        <w:t>(x, z, giro)</w:t>
+      </w:r>
+      <w:r>
+        <w:t xml:space="preserve"> y </w:t>
+      </w:r>
+      <w:proofErr w:type="spellStart"/>
+      <w:r>
+        <w:rPr>
+          <w:rFonts w:ascii="Consolas" w:eastAsia="Consolas" w:hAnsi="Consolas" w:cs="Consolas"/>
+          <w:color w:val="8A3B12"/>
+          <w:sz w:val="20"/>
+          <w:szCs w:val="20"/>
+        </w:rPr>
+        <w:t>r.parte</w:t>
+      </w:r>
+      <w:proofErr w:type="spellEnd"/>
+      <w:r>
+        <w:rPr>
+          <w:rFonts w:ascii="Consolas" w:eastAsia="Consolas" w:hAnsi="Consolas" w:cs="Consolas"/>
+          <w:color w:val="8A3B12"/>
+          <w:sz w:val="20"/>
+          <w:szCs w:val="20"/>
+        </w:rPr>
+        <w:t>(...)</w:t>
       </w:r>
       <w:r>
         <w:t xml:space="preserve"> para escribir sus piezas en coordenadas locales.</w:t>
@@ -7499,7 +7826,15 @@
               <w:t>clase1</w:t>
             </w:r>
             <w:r>
-              <w:t>: ventana, shaders, cubo, mapa y cámara orbital</w:t>
+              <w:t xml:space="preserve">: ventana, </w:t>
+            </w:r>
+            <w:proofErr w:type="spellStart"/>
+            <w:r>
+              <w:t>shaders</w:t>
+            </w:r>
+            <w:proofErr w:type="spellEnd"/>
+            <w:r>
+              <w:t>, cubo, mapa y cámara orbital</w:t>
             </w:r>
           </w:p>
         </w:tc>
@@ -7532,6 +7867,7 @@
             <w:r>
               <w:t xml:space="preserve">, </w:t>
             </w:r>
+            <w:proofErr w:type="spellStart"/>
             <w:r>
               <w:rPr>
                 <w:rFonts w:ascii="Consolas" w:eastAsia="Consolas" w:hAnsi="Consolas" w:cs="Consolas"/>
@@ -7541,9 +7877,11 @@
               </w:rPr>
               <w:t>Renderizador</w:t>
             </w:r>
+            <w:proofErr w:type="spellEnd"/>
             <w:r>
               <w:t xml:space="preserve">, </w:t>
             </w:r>
+            <w:proofErr w:type="spellStart"/>
             <w:r>
               <w:rPr>
                 <w:rFonts w:ascii="Consolas" w:eastAsia="Consolas" w:hAnsi="Consolas" w:cs="Consolas"/>
@@ -7553,6 +7891,7 @@
               </w:rPr>
               <w:t>Shaders</w:t>
             </w:r>
+            <w:proofErr w:type="spellEnd"/>
             <w:r>
               <w:t xml:space="preserve">, </w:t>
             </w:r>
@@ -7592,6 +7931,7 @@
             <w:r>
               <w:t xml:space="preserve">, </w:t>
             </w:r>
+            <w:proofErr w:type="spellStart"/>
             <w:r>
               <w:rPr>
                 <w:rFonts w:ascii="Consolas" w:eastAsia="Consolas" w:hAnsi="Consolas" w:cs="Consolas"/>
@@ -7601,6 +7941,7 @@
               </w:rPr>
               <w:t>Camara</w:t>
             </w:r>
+            <w:proofErr w:type="spellEnd"/>
           </w:p>
         </w:tc>
       </w:tr>
@@ -7666,6 +8007,7 @@
             <w:r>
               <w:t xml:space="preserve">, </w:t>
             </w:r>
+            <w:proofErr w:type="spellStart"/>
             <w:r>
               <w:rPr>
                 <w:rFonts w:ascii="Consolas" w:eastAsia="Consolas" w:hAnsi="Consolas" w:cs="Consolas"/>
@@ -7673,11 +8015,9 @@
                 <w:sz w:val="20"/>
                 <w:szCs w:val="20"/>
               </w:rPr>
-              <w:t>Mapa.puedeOcupar()</w:t>
-            </w:r>
-            <w:r>
-              <w:t xml:space="preserve">, </w:t>
-            </w:r>
+              <w:t>Mapa.puedeOcupar</w:t>
+            </w:r>
+            <w:proofErr w:type="spellEnd"/>
             <w:r>
               <w:rPr>
                 <w:rFonts w:ascii="Consolas" w:eastAsia="Consolas" w:hAnsi="Consolas" w:cs="Consolas"/>
@@ -7685,8 +8025,22 @@
                 <w:sz w:val="20"/>
                 <w:szCs w:val="20"/>
               </w:rPr>
+              <w:t>()</w:t>
+            </w:r>
+            <w:r>
+              <w:t xml:space="preserve">, </w:t>
+            </w:r>
+            <w:proofErr w:type="spellStart"/>
+            <w:r>
+              <w:rPr>
+                <w:rFonts w:ascii="Consolas" w:eastAsia="Consolas" w:hAnsi="Consolas" w:cs="Consolas"/>
+                <w:color w:val="8A3B12"/>
+                <w:sz w:val="20"/>
+                <w:szCs w:val="20"/>
+              </w:rPr>
               <w:t>Camara</w:t>
             </w:r>
+            <w:proofErr w:type="spellEnd"/>
           </w:p>
         </w:tc>
       </w:tr>
@@ -7718,7 +8072,15 @@
               <w:t>clase3</w:t>
             </w:r>
             <w:r>
-              <w:t>: día/noche, farolas, faros y shader de iluminación</w:t>
+              <w:t xml:space="preserve">: día/noche, farolas, faros y </w:t>
+            </w:r>
+            <w:proofErr w:type="spellStart"/>
+            <w:r>
+              <w:t>shader</w:t>
+            </w:r>
+            <w:proofErr w:type="spellEnd"/>
+            <w:r>
+              <w:t xml:space="preserve"> de iluminación</w:t>
             </w:r>
           </w:p>
         </w:tc>
@@ -7739,6 +8101,7 @@
             </w:tcMar>
           </w:tcPr>
           <w:p>
+            <w:proofErr w:type="spellStart"/>
             <w:r>
               <w:rPr>
                 <w:rFonts w:ascii="Consolas" w:eastAsia="Consolas" w:hAnsi="Consolas" w:cs="Consolas"/>
@@ -7748,6 +8111,7 @@
               </w:rPr>
               <w:t>Iluminacion</w:t>
             </w:r>
+            <w:proofErr w:type="spellEnd"/>
             <w:r>
               <w:t xml:space="preserve">, </w:t>
             </w:r>
@@ -7763,6 +8127,7 @@
             <w:r>
               <w:t xml:space="preserve">, </w:t>
             </w:r>
+            <w:proofErr w:type="spellStart"/>
             <w:r>
               <w:rPr>
                 <w:rFonts w:ascii="Consolas" w:eastAsia="Consolas" w:hAnsi="Consolas" w:cs="Consolas"/>
@@ -7772,6 +8137,7 @@
               </w:rPr>
               <w:t>Shaders</w:t>
             </w:r>
+            <w:proofErr w:type="spellEnd"/>
           </w:p>
         </w:tc>
       </w:tr>
@@ -7803,8 +8169,13 @@
               <w:t>clase4</w:t>
             </w:r>
             <w:r>
-              <w:t>: ventanas, parques, pasos peatonales, semáforos, entregas y minimapa</w:t>
-            </w:r>
+              <w:t xml:space="preserve">: ventanas, parques, pasos peatonales, semáforos, entregas y </w:t>
+            </w:r>
+            <w:proofErr w:type="spellStart"/>
+            <w:r>
+              <w:t>minimapa</w:t>
+            </w:r>
+            <w:proofErr w:type="spellEnd"/>
           </w:p>
         </w:tc>
         <w:tc>
@@ -7860,6 +8231,7 @@
             <w:r>
               <w:t xml:space="preserve">, </w:t>
             </w:r>
+            <w:proofErr w:type="spellStart"/>
             <w:r>
               <w:rPr>
                 <w:rFonts w:ascii="Consolas" w:eastAsia="Consolas" w:hAnsi="Consolas" w:cs="Consolas"/>
@@ -7869,6 +8241,7 @@
               </w:rPr>
               <w:t>Semaforo</w:t>
             </w:r>
+            <w:proofErr w:type="spellEnd"/>
             <w:r>
               <w:t xml:space="preserve">, </w:t>
             </w:r>
@@ -7884,6 +8257,7 @@
             <w:r>
               <w:t xml:space="preserve">, </w:t>
             </w:r>
+            <w:proofErr w:type="spellStart"/>
             <w:r>
               <w:rPr>
                 <w:rFonts w:ascii="Consolas" w:eastAsia="Consolas" w:hAnsi="Consolas" w:cs="Consolas"/>
@@ -7893,6 +8267,7 @@
               </w:rPr>
               <w:t>Minimapa</w:t>
             </w:r>
+            <w:proofErr w:type="spellEnd"/>
           </w:p>
         </w:tc>
       </w:tr>
@@ -8238,7 +8613,15 @@
           </w:tcPr>
           <w:p>
             <w:r>
-              <w:t>Suelo, límites, colisiones, cámaras y minimapa adaptados</w:t>
+              <w:t xml:space="preserve">Suelo, límites, colisiones, cámaras y </w:t>
+            </w:r>
+            <w:proofErr w:type="spellStart"/>
+            <w:r>
+              <w:t>minimapa</w:t>
+            </w:r>
+            <w:proofErr w:type="spellEnd"/>
+            <w:r>
+              <w:t xml:space="preserve"> adaptados</w:t>
             </w:r>
           </w:p>
         </w:tc>
@@ -8317,6 +8700,7 @@
             <w:r>
               <w:t xml:space="preserve">, </w:t>
             </w:r>
+            <w:proofErr w:type="spellStart"/>
             <w:r>
               <w:rPr>
                 <w:rFonts w:ascii="Consolas" w:eastAsia="Consolas" w:hAnsi="Consolas" w:cs="Consolas"/>
@@ -8326,9 +8710,11 @@
               </w:rPr>
               <w:t>Camara</w:t>
             </w:r>
+            <w:proofErr w:type="spellEnd"/>
             <w:r>
               <w:t xml:space="preserve">, </w:t>
             </w:r>
+            <w:proofErr w:type="spellStart"/>
             <w:r>
               <w:rPr>
                 <w:rFonts w:ascii="Consolas" w:eastAsia="Consolas" w:hAnsi="Consolas" w:cs="Consolas"/>
@@ -8338,6 +8724,7 @@
               </w:rPr>
               <w:t>Minimapa</w:t>
             </w:r>
+            <w:proofErr w:type="spellEnd"/>
           </w:p>
         </w:tc>
       </w:tr>
@@ -8403,6 +8790,7 @@
             </w:tcMar>
           </w:tcPr>
           <w:p>
+            <w:proofErr w:type="spellStart"/>
             <w:r>
               <w:rPr>
                 <w:rFonts w:ascii="Consolas" w:eastAsia="Consolas" w:hAnsi="Consolas" w:cs="Consolas"/>
@@ -8412,9 +8800,11 @@
               </w:rPr>
               <w:t>Iluminacion</w:t>
             </w:r>
+            <w:proofErr w:type="spellEnd"/>
             <w:r>
               <w:t xml:space="preserve">, </w:t>
             </w:r>
+            <w:proofErr w:type="spellStart"/>
             <w:r>
               <w:rPr>
                 <w:rFonts w:ascii="Consolas" w:eastAsia="Consolas" w:hAnsi="Consolas" w:cs="Consolas"/>
@@ -8424,6 +8814,7 @@
               </w:rPr>
               <w:t>Shaders</w:t>
             </w:r>
+            <w:proofErr w:type="spellEnd"/>
           </w:p>
         </w:tc>
       </w:tr>
@@ -8501,6 +8892,7 @@
             <w:r>
               <w:t xml:space="preserve">, </w:t>
             </w:r>
+            <w:proofErr w:type="spellStart"/>
             <w:r>
               <w:rPr>
                 <w:rFonts w:ascii="Consolas" w:eastAsia="Consolas" w:hAnsi="Consolas" w:cs="Consolas"/>
@@ -8510,6 +8902,7 @@
               </w:rPr>
               <w:t>Iluminacion</w:t>
             </w:r>
+            <w:proofErr w:type="spellEnd"/>
           </w:p>
         </w:tc>
       </w:tr>
@@ -8556,6 +8949,7 @@
             <w:r>
               <w:t>Dos focos que siguen al auto: haz central y relleno (</w:t>
             </w:r>
+            <w:proofErr w:type="spellStart"/>
             <w:r>
               <w:rPr>
                 <w:rFonts w:ascii="Consolas" w:eastAsia="Consolas" w:hAnsi="Consolas" w:cs="Consolas"/>
@@ -8565,6 +8959,7 @@
               </w:rPr>
               <w:t>smoothstep</w:t>
             </w:r>
+            <w:proofErr w:type="spellEnd"/>
             <w:r>
               <w:t>), atenuación y alcance limitado a 24–32 unidades; el vidrio del faro brilla al encenderlos</w:t>
             </w:r>
@@ -8587,6 +8982,7 @@
             </w:tcMar>
           </w:tcPr>
           <w:p>
+            <w:proofErr w:type="spellStart"/>
             <w:r>
               <w:rPr>
                 <w:rFonts w:ascii="Consolas" w:eastAsia="Consolas" w:hAnsi="Consolas" w:cs="Consolas"/>
@@ -8596,9 +8992,11 @@
               </w:rPr>
               <w:t>Iluminacion</w:t>
             </w:r>
+            <w:proofErr w:type="spellEnd"/>
             <w:r>
               <w:t xml:space="preserve">, </w:t>
             </w:r>
+            <w:proofErr w:type="spellStart"/>
             <w:r>
               <w:rPr>
                 <w:rFonts w:ascii="Consolas" w:eastAsia="Consolas" w:hAnsi="Consolas" w:cs="Consolas"/>
@@ -8608,6 +9006,7 @@
               </w:rPr>
               <w:t>Shaders</w:t>
             </w:r>
+            <w:proofErr w:type="spellEnd"/>
             <w:r>
               <w:t xml:space="preserve">, </w:t>
             </w:r>
@@ -8783,6 +9182,7 @@
             </w:tcMar>
           </w:tcPr>
           <w:p>
+            <w:proofErr w:type="spellStart"/>
             <w:r>
               <w:rPr>
                 <w:rFonts w:ascii="Consolas" w:eastAsia="Consolas" w:hAnsi="Consolas" w:cs="Consolas"/>
@@ -8792,6 +9192,7 @@
               </w:rPr>
               <w:t>Semaforo</w:t>
             </w:r>
+            <w:proofErr w:type="spellEnd"/>
           </w:p>
         </w:tc>
       </w:tr>
@@ -8813,9 +9214,14 @@
             </w:tcMar>
           </w:tcPr>
           <w:p>
+            <w:proofErr w:type="spellStart"/>
             <w:r>
               <w:lastRenderedPageBreak/>
-              <w:t>Minimapa con M</w:t>
+              <w:t>Minimapa</w:t>
+            </w:r>
+            <w:proofErr w:type="spellEnd"/>
+            <w:r>
+              <w:t xml:space="preserve"> con M</w:t>
             </w:r>
           </w:p>
         </w:tc>
@@ -8858,6 +9264,7 @@
             </w:tcMar>
           </w:tcPr>
           <w:p>
+            <w:proofErr w:type="spellStart"/>
             <w:r>
               <w:rPr>
                 <w:rFonts w:ascii="Consolas" w:eastAsia="Consolas" w:hAnsi="Consolas" w:cs="Consolas"/>
@@ -8867,6 +9274,7 @@
               </w:rPr>
               <w:t>Minimapa</w:t>
             </w:r>
+            <w:proofErr w:type="spellEnd"/>
           </w:p>
         </w:tc>
       </w:tr>
@@ -8932,6 +9340,7 @@
             </w:tcMar>
           </w:tcPr>
           <w:p>
+            <w:proofErr w:type="spellStart"/>
             <w:r>
               <w:rPr>
                 <w:rFonts w:ascii="Consolas" w:eastAsia="Consolas" w:hAnsi="Consolas" w:cs="Consolas"/>
@@ -8939,7 +9348,17 @@
                 <w:sz w:val="20"/>
                 <w:szCs w:val="20"/>
               </w:rPr>
-              <w:t>Juego.reiniciar()</w:t>
+              <w:t>Juego.reiniciar</w:t>
+            </w:r>
+            <w:proofErr w:type="spellEnd"/>
+            <w:r>
+              <w:rPr>
+                <w:rFonts w:ascii="Consolas" w:eastAsia="Consolas" w:hAnsi="Consolas" w:cs="Consolas"/>
+                <w:color w:val="8A3B12"/>
+                <w:sz w:val="20"/>
+                <w:szCs w:val="20"/>
+              </w:rPr>
+              <w:t>()</w:t>
             </w:r>
           </w:p>
         </w:tc>
@@ -9012,8 +9431,20 @@
           <w:sz w:val="18"/>
           <w:szCs w:val="18"/>
         </w:rPr>
-        <w:t>Conducción nocturna por Calle Concha: faros, farolas, ventanas encendidas, destino dorado y minimapa</w:t>
-      </w:r>
+        <w:t xml:space="preserve">Conducción nocturna por Calle Concha: faros, farolas, ventanas encendidas, destino dorado y </w:t>
+      </w:r>
+      <w:proofErr w:type="spellStart"/>
+      <w:r>
+        <w:rPr>
+          <w:i/>
+          <w:iCs/>
+          <w:color w:val="5A6470"/>
+          <w:sz w:val="18"/>
+          <w:szCs w:val="18"/>
+        </w:rPr>
+        <w:t>minimapa</w:t>
+      </w:r>
+      <w:proofErr w:type="spellEnd"/>
     </w:p>
     <w:p>
       <w:pPr>
@@ -9030,7 +9461,15 @@
         <w:spacing w:after="120"/>
       </w:pPr>
       <w:r>
-        <w:t>La entrega de paquetes se transformó en el reparto de Cangreburgers: casa de Bob → Calamardo → Patricio (las tres en Calle Concha, como en la serie) → Balde de Carnada → regreso al Crustáceo Cascarudo. Los personajes se construyen con cajas y se animan con seno y coseno del reloj.</w:t>
+        <w:t xml:space="preserve">La entrega de paquetes se transformó en el reparto de </w:t>
+      </w:r>
+      <w:proofErr w:type="spellStart"/>
+      <w:r>
+        <w:t>Cangreburgers</w:t>
+      </w:r>
+      <w:proofErr w:type="spellEnd"/>
+      <w:r>
+        <w:t>: casa de Bob → Calamardo → Patricio (las tres en Calle Concha, como en la serie) → Balde de Carnada → regreso al Crustáceo Cascarudo. Los personajes se construyen con cajas y se animan con seno y coseno del reloj.</w:t>
       </w:r>
     </w:p>
     <w:p>
@@ -9047,11 +9486,29 @@
           <w:b/>
           <w:bCs/>
         </w:rPr>
-        <w:t>Bob en el botemóvil:</w:t>
+        <w:t xml:space="preserve">Bob en el </w:t>
+      </w:r>
+      <w:proofErr w:type="spellStart"/>
+      <w:r>
+        <w:rPr>
+          <w:b/>
+          <w:bCs/>
+        </w:rPr>
+        <w:t>botemóvil</w:t>
+      </w:r>
+      <w:proofErr w:type="spellEnd"/>
+      <w:r>
+        <w:rPr>
+          <w:b/>
+          <w:bCs/>
+        </w:rPr>
+        <w:t>:</w:t>
       </w:r>
       <w:r>
         <w:t xml:space="preserve"> el auto se reemplazó sobrescribiendo </w:t>
       </w:r>
+      <w:proofErr w:type="spellStart"/>
+      <w:proofErr w:type="gramStart"/>
       <w:r>
         <w:rPr>
           <w:rFonts w:ascii="Consolas" w:eastAsia="Consolas" w:hAnsi="Consolas" w:cs="Consolas"/>
@@ -9059,7 +9516,27 @@
           <w:sz w:val="20"/>
           <w:szCs w:val="20"/>
         </w:rPr>
-        <w:t>dibujarAuto()</w:t>
+        <w:t>dibujarAuto</w:t>
+      </w:r>
+      <w:proofErr w:type="spellEnd"/>
+      <w:r>
+        <w:rPr>
+          <w:rFonts w:ascii="Consolas" w:eastAsia="Consolas" w:hAnsi="Consolas" w:cs="Consolas"/>
+          <w:color w:val="8A3B12"/>
+          <w:sz w:val="20"/>
+          <w:szCs w:val="20"/>
+        </w:rPr>
+        <w:t>(</w:t>
+      </w:r>
+      <w:proofErr w:type="gramEnd"/>
+      <w:r>
+        <w:rPr>
+          <w:rFonts w:ascii="Consolas" w:eastAsia="Consolas" w:hAnsi="Consolas" w:cs="Consolas"/>
+          <w:color w:val="8A3B12"/>
+          <w:sz w:val="20"/>
+          <w:szCs w:val="20"/>
+        </w:rPr>
+        <w:t>)</w:t>
       </w:r>
       <w:r>
         <w:t xml:space="preserve"> con </w:t>
@@ -9094,7 +9571,15 @@
         <w:t>Personajes que reaccionan:</w:t>
       </w:r>
       <w:r>
-        <w:t xml:space="preserve"> cuando el botemóvil está a menos de 14 unidades, giran para mirarlo (</w:t>
+        <w:t xml:space="preserve"> cuando el </w:t>
+      </w:r>
+      <w:proofErr w:type="spellStart"/>
+      <w:r>
+        <w:t>botemóvil</w:t>
+      </w:r>
+      <w:proofErr w:type="spellEnd"/>
+      <w:r>
+        <w:t xml:space="preserve"> está a menos de 14 unidades, giran para mirarlo (</w:t>
       </w:r>
       <w:r>
         <w:rPr>
@@ -9106,7 +9591,15 @@
         <w:t>atan2</w:t>
       </w:r>
       <w:r>
-        <w:t xml:space="preserve"> con la misma convención de ángulo que el auto). Patricio duerme con burbujas de ronquido y despierta saltando; Calamardo toca el clarinete con notas flotantes y tiembla molesto si te acercas; Don Cangrejo aplaude con sus tenazas y celebra al completar las entregas; Plankton salta enojado.</w:t>
+        <w:t xml:space="preserve"> con la misma convención de ángulo que el auto). Patricio duerme con burbujas de ronquido y despierta saltando; Calamardo toca el clarinete con notas flotantes y tiembla molesto si te acercas; Don Cangrejo aplaude con sus tenazas y celebra al completar las entregas; </w:t>
+      </w:r>
+      <w:proofErr w:type="spellStart"/>
+      <w:r>
+        <w:t>Plankton</w:t>
+      </w:r>
+      <w:proofErr w:type="spellEnd"/>
+      <w:r>
+        <w:t xml:space="preserve"> salta enojado.</w:t>
       </w:r>
     </w:p>
     <w:p>
@@ -9192,7 +9685,29 @@
           <w:sz w:val="18"/>
           <w:szCs w:val="18"/>
         </w:rPr>
-        <w:t>Bob Esponja al volante del botemóvil; Patricio despierto lo saluda desde la acera</w:t>
+        <w:t xml:space="preserve">Bob Esponja al volante del </w:t>
+      </w:r>
+      <w:proofErr w:type="spellStart"/>
+      <w:r>
+        <w:rPr>
+          <w:i/>
+          <w:iCs/>
+          <w:color w:val="5A6470"/>
+          <w:sz w:val="18"/>
+          <w:szCs w:val="18"/>
+        </w:rPr>
+        <w:t>botemóvil</w:t>
+      </w:r>
+      <w:proofErr w:type="spellEnd"/>
+      <w:r>
+        <w:rPr>
+          <w:i/>
+          <w:iCs/>
+          <w:color w:val="5A6470"/>
+          <w:sz w:val="18"/>
+          <w:szCs w:val="18"/>
+        </w:rPr>
+        <w:t>; Patricio despierto lo saluda desde la acera</w:t>
       </w:r>
     </w:p>
     <w:p>
@@ -9474,6 +9989,7 @@
       <w:r>
         <w:t xml:space="preserve">Cuatro botes circulan sin intervención del usuario, cada uno con un pez al volante. Cada bote es un </w:t>
       </w:r>
+      <w:proofErr w:type="spellStart"/>
       <w:r>
         <w:rPr>
           <w:rFonts w:ascii="Consolas" w:eastAsia="Consolas" w:hAnsi="Consolas" w:cs="Consolas"/>
@@ -9483,6 +9999,7 @@
         </w:rPr>
         <w:t>Vehiculo</w:t>
       </w:r>
+      <w:proofErr w:type="spellEnd"/>
       <w:r>
         <w:t xml:space="preserve"> y </w:t>
       </w:r>
@@ -9708,8 +10225,25 @@
         <w:t>MAPA</w:t>
       </w:r>
       <w:r>
-        <w:t xml:space="preserve">) y cada tramo de unos se dibuja como una caja. El vertex shader tiene un modo </w:t>
-      </w:r>
+        <w:t xml:space="preserve">) y cada tramo de unos se dibuja como una caja. El </w:t>
+      </w:r>
+      <w:proofErr w:type="spellStart"/>
+      <w:r>
+        <w:t>vertex</w:t>
+      </w:r>
+      <w:proofErr w:type="spellEnd"/>
+      <w:r>
+        <w:t xml:space="preserve"> </w:t>
+      </w:r>
+      <w:proofErr w:type="spellStart"/>
+      <w:r>
+        <w:t>shader</w:t>
+      </w:r>
+      <w:proofErr w:type="spellEnd"/>
+      <w:r>
+        <w:t xml:space="preserve"> tiene un modo </w:t>
+      </w:r>
+      <w:proofErr w:type="spellStart"/>
       <w:r>
         <w:rPr>
           <w:rFonts w:ascii="Consolas" w:eastAsia="Consolas" w:hAnsi="Consolas" w:cs="Consolas"/>
@@ -9717,7 +10251,17 @@
           <w:sz w:val="20"/>
           <w:szCs w:val="20"/>
         </w:rPr>
-        <w:t>uMapa = 2</w:t>
+        <w:t>uMapa</w:t>
+      </w:r>
+      <w:proofErr w:type="spellEnd"/>
+      <w:r>
+        <w:rPr>
+          <w:rFonts w:ascii="Consolas" w:eastAsia="Consolas" w:hAnsi="Consolas" w:cs="Consolas"/>
+          <w:color w:val="8A3B12"/>
+          <w:sz w:val="20"/>
+          <w:szCs w:val="20"/>
+        </w:rPr>
+        <w:t xml:space="preserve"> = 2</w:t>
       </w:r>
       <w:r>
         <w:t xml:space="preserve"> que dibuja en píxeles de pantalla.</w:t>
@@ -9864,7 +10408,15 @@
         <w:t>Semáforos de dos direcciones:</w:t>
       </w:r>
       <w:r>
-        <w:t xml:space="preserve"> un cabezal para cada calle del cruce, con placa amarilla, viseras y luces en ambas caras, para verlos desde cualquier dirección. Las luces apagadas se ven como vidrios oscuros de color, el amarillo dura 2 s y nunca hay dos direcciones en verde. De noche cada cabezal tiñe su esquina con su color mediante las luces de color de corto alcance del shader.</w:t>
+        <w:t xml:space="preserve"> un cabezal para cada calle del cruce, con placa amarilla, viseras y luces en ambas caras, para verlos desde cualquier dirección. Las luces apagadas se ven como vidrios oscuros de color, el amarillo dura 2 s y nunca hay dos direcciones en verde. De noche cada cabezal tiñe su esquina con su color mediante las luces de color de corto alcance del </w:t>
+      </w:r>
+      <w:proofErr w:type="spellStart"/>
+      <w:r>
+        <w:t>shader</w:t>
+      </w:r>
+      <w:proofErr w:type="spellEnd"/>
+      <w:r>
+        <w:t>.</w:t>
       </w:r>
     </w:p>
     <w:p>
@@ -9906,6 +10458,7 @@
       <w:r>
         <w:t xml:space="preserve"> tronco alto y copa de tres niveles alternados a 45°, en tres tamaños, que se mecen con el agua. Están en la clase </w:t>
       </w:r>
+      <w:proofErr w:type="spellStart"/>
       <w:r>
         <w:rPr>
           <w:rFonts w:ascii="Consolas" w:eastAsia="Consolas" w:hAnsi="Consolas" w:cs="Consolas"/>
@@ -9915,6 +10468,7 @@
         </w:rPr>
         <w:t>Arbol</w:t>
       </w:r>
+      <w:proofErr w:type="spellEnd"/>
       <w:r>
         <w:t>.</w:t>
       </w:r>
@@ -9958,6 +10512,7 @@
       <w:r>
         <w:t xml:space="preserve"> seis colores de fachada (paleta de </w:t>
       </w:r>
+      <w:proofErr w:type="spellStart"/>
       <w:r>
         <w:rPr>
           <w:rFonts w:ascii="Consolas" w:eastAsia="Consolas" w:hAnsi="Consolas" w:cs="Consolas"/>
@@ -9965,7 +10520,17 @@
           <w:sz w:val="20"/>
           <w:szCs w:val="20"/>
         </w:rPr>
-        <w:t>Mapa.colorEdificio()</w:t>
+        <w:t>Mapa.colorEdificio</w:t>
+      </w:r>
+      <w:proofErr w:type="spellEnd"/>
+      <w:r>
+        <w:rPr>
+          <w:rFonts w:ascii="Consolas" w:eastAsia="Consolas" w:hAnsi="Consolas" w:cs="Consolas"/>
+          <w:color w:val="8A3B12"/>
+          <w:sz w:val="20"/>
+          <w:szCs w:val="20"/>
+        </w:rPr>
+        <w:t>()</w:t>
       </w:r>
       <w:r>
         <w:t>), puerta con toldo de tienda, árboles de vereda, hidrante, basurero, banco, tanque de agua, aire acondicionado y antena con luz intermitente.</w:t>
@@ -10824,8 +11389,13 @@
           </w:tcPr>
           <w:p>
             <w:r>
-              <w:t>Mostrar / ocultar minimapa</w:t>
-            </w:r>
+              <w:t xml:space="preserve">Mostrar / ocultar </w:t>
+            </w:r>
+            <w:proofErr w:type="spellStart"/>
+            <w:r>
+              <w:t>minimapa</w:t>
+            </w:r>
+            <w:proofErr w:type="spellEnd"/>
           </w:p>
         </w:tc>
       </w:tr>
@@ -10932,7 +11502,15 @@
         <w:spacing w:after="120"/>
       </w:pPr>
       <w:r>
-        <w:t>Para entregar una Cangreburger hay que llegar a la marca dorada del destino y frenar a menos de 1 unidad por segundo. El título de la ventana mantiene el indicador básico del proyecto de referencia.</w:t>
+        <w:t xml:space="preserve">Para entregar una </w:t>
+      </w:r>
+      <w:proofErr w:type="spellStart"/>
+      <w:r>
+        <w:t>Cangreburger</w:t>
+      </w:r>
+      <w:proofErr w:type="spellEnd"/>
+      <w:r>
+        <w:t xml:space="preserve"> hay que llegar a la marca dorada del destino y frenar a menos de 1 unidad por segundo. El título de la ventana mantiene el indicador básico del proyecto de referencia.</w:t>
       </w:r>
     </w:p>
     <w:p>
@@ -10949,6 +11527,7 @@
       <w:pPr>
         <w:spacing w:after="120"/>
       </w:pPr>
+      <w:proofErr w:type="spellStart"/>
       <w:r>
         <w:rPr>
           <w:rFonts w:ascii="Consolas" w:eastAsia="Consolas" w:hAnsi="Consolas" w:cs="Consolas"/>
@@ -10956,7 +11535,17 @@
           <w:sz w:val="20"/>
           <w:szCs w:val="20"/>
         </w:rPr>
-        <w:t>mvnw test</w:t>
+        <w:t>mvnw</w:t>
+      </w:r>
+      <w:proofErr w:type="spellEnd"/>
+      <w:r>
+        <w:rPr>
+          <w:rFonts w:ascii="Consolas" w:eastAsia="Consolas" w:hAnsi="Consolas" w:cs="Consolas"/>
+          <w:color w:val="8A3B12"/>
+          <w:sz w:val="20"/>
+          <w:szCs w:val="20"/>
+        </w:rPr>
+        <w:t xml:space="preserve"> test</w:t>
       </w:r>
       <w:r>
         <w:t xml:space="preserve"> ejecuta 11 pruebas de lógica sin abrir ventanas:</w:t>
@@ -11131,10 +11720,38 @@
           <w:sz w:val="20"/>
           <w:szCs w:val="20"/>
         </w:rPr>
-        <w:t>-Ddemo.frames=30</w:t>
-      </w:r>
-      <w:r>
-        <w:t xml:space="preserve"> sin errores de compilación de shaders ni de OpenGL, y se revisaron con capturas de pantalla de día, de noche, en pausa y con el tráfico en movimiento.</w:t>
+        <w:t>-</w:t>
+      </w:r>
+      <w:proofErr w:type="spellStart"/>
+      <w:r>
+        <w:rPr>
+          <w:rFonts w:ascii="Consolas" w:eastAsia="Consolas" w:hAnsi="Consolas" w:cs="Consolas"/>
+          <w:color w:val="8A3B12"/>
+          <w:sz w:val="20"/>
+          <w:szCs w:val="20"/>
+        </w:rPr>
+        <w:t>Ddemo.frames</w:t>
+      </w:r>
+      <w:proofErr w:type="spellEnd"/>
+      <w:r>
+        <w:rPr>
+          <w:rFonts w:ascii="Consolas" w:eastAsia="Consolas" w:hAnsi="Consolas" w:cs="Consolas"/>
+          <w:color w:val="8A3B12"/>
+          <w:sz w:val="20"/>
+          <w:szCs w:val="20"/>
+        </w:rPr>
+        <w:t>=30</w:t>
+      </w:r>
+      <w:r>
+        <w:t xml:space="preserve"> sin errores de compilación de </w:t>
+      </w:r>
+      <w:proofErr w:type="spellStart"/>
+      <w:r>
+        <w:t>shaders</w:t>
+      </w:r>
+      <w:proofErr w:type="spellEnd"/>
+      <w:r>
+        <w:t xml:space="preserve"> ni de OpenGL, y se revisaron con capturas de pantalla de día, de noche, en pausa y con el tráfico en movimiento.</w:t>
       </w:r>
     </w:p>
     <w:p>
@@ -11223,7 +11840,15 @@
         <w:spacing w:after="60"/>
       </w:pPr>
       <w:r>
-        <w:t>El shader solo rota objetos alrededor del eje Y, por eso las animaciones usan traslaciones, giros horizontales y cambios de tamaño (no hay brazos que balanceen).</w:t>
+        <w:t xml:space="preserve">El </w:t>
+      </w:r>
+      <w:proofErr w:type="spellStart"/>
+      <w:r>
+        <w:t>shader</w:t>
+      </w:r>
+      <w:proofErr w:type="spellEnd"/>
+      <w:r>
+        <w:t xml:space="preserve"> solo rota objetos alrededor del eje Y, por eso las animaciones usan traslaciones, giros horizontales y cambios de tamaño (no hay brazos que balanceen).</w:t>
       </w:r>
     </w:p>
     <w:p>
@@ -11311,7 +11936,15 @@
         <w:t>Bibliotecas:</w:t>
       </w:r>
       <w:r>
-        <w:t xml:space="preserve"> LWJGL 3.3.3 (GLFW y OpenGL) y JUnit 3.8.1, declaradas en </w:t>
+        <w:t xml:space="preserve"> LWJGL 3.3.3 (GLFW y OpenGL) y </w:t>
+      </w:r>
+      <w:proofErr w:type="spellStart"/>
+      <w:r>
+        <w:t>JUnit</w:t>
+      </w:r>
+      <w:proofErr w:type="spellEnd"/>
+      <w:r>
+        <w:t xml:space="preserve"> 3.8.1, declaradas en </w:t>
       </w:r>
       <w:r>
         <w:rPr>
@@ -11353,7 +11986,15 @@
         </w:rPr>
       </w:pPr>
       <w:r>
-        <w:t>Los personajes y lugares son referencias a la serie «Bob Esponja» (Nickelodeon), recreados con fines educativos.</w:t>
+        <w:t>Los personajes y lugares son referencias a la serie «Bob Esponja» (</w:t>
+      </w:r>
+      <w:proofErr w:type="spellStart"/>
+      <w:r>
+        <w:t>Nickelodeon</w:t>
+      </w:r>
+      <w:proofErr w:type="spellEnd"/>
+      <w:r>
+        <w:t>), recreados con fines educativos.</w:t>
       </w:r>
     </w:p>
     <w:sectPr>

</xml_diff>